<commit_message>
Rebuild lab design around chosen Juice Shop Score-Board challenges
Lab design now maps to the five challenges the team will actually
complete: Broken Access Control (View Basket IDOR, Admin Section,
Confidential Document), SQL Injection (Login Admin), and DOM XSS. Each
challenge includes step-by-step procedure, star rating, root cause,
and a matched defense re-tested in the companion app. Gantt timeline
and intro updated to match.

Co-Authored-By: Claude Opus 4.8 <noreply@anthropic.com>
Claude-Session: https://claude.ai/code/session_01HbA2cVDNwbkk82KSbnoyhR
</commit_message>
<xml_diff>
--- a/juice-shop-project/Juice_Shop_Lab_Design.docx
+++ b/juice-shop-project/Juice_Shop_Lab_Design.docx
@@ -965,7 +965,7 @@
           <w:sz w:val="24"/>
           <w:szCs w:val="24"/>
         </w:rPr>
-        <w:t xml:space="preserve">Lab 1 – SQL Injection (SQLi)</w:t>
+        <w:t xml:space="preserve">Lab 1 – Broken Access Control</w:t>
       </w:r>
     </w:p>
     <w:p>
@@ -990,7 +990,7 @@
           <w:sz w:val="22"/>
           <w:szCs w:val="22"/>
         </w:rPr>
-        <w:t xml:space="preserve">How can SQL injection interfere with authentication logic and expose stored data?</w:t>
+        <w:t xml:space="preserve">How can missing authorization checks let one user reach another user's data, an admin-only area, or a restricted file?</w:t>
       </w:r>
     </w:p>
     <w:p>
@@ -1002,12 +1002,19 @@
           <w:rFonts w:ascii="Calibri" w:cs="Calibri" w:eastAsia="Calibri" w:hAnsi="Calibri"/>
           <w:b/>
           <w:bCs/>
-          <w:i w:val="false"/>
-          <w:iCs w:val="false"/>
-          <w:sz w:val="22"/>
-          <w:szCs w:val="22"/>
-        </w:rPr>
-        <w:t xml:space="preserve">Attack procedure:</w:t>
+          <w:sz w:val="22"/>
+          <w:szCs w:val="22"/>
+        </w:rPr>
+        <w:t xml:space="preserve">Challenge: View Basket (Basket Access)  </w:t>
+      </w:r>
+      <w:r>
+        <w:rPr>
+          <w:rFonts w:ascii="Calibri" w:cs="Calibri" w:eastAsia="Calibri" w:hAnsi="Calibri"/>
+          <w:color w:val="C55A11"/>
+          <w:sz w:val="20"/>
+          <w:szCs w:val="20"/>
+        </w:rPr>
+        <w:t xml:space="preserve">★★ (2-star)</w:t>
       </w:r>
     </w:p>
     <w:p>
@@ -1025,7 +1032,7 @@
           <w:sz w:val="22"/>
           <w:szCs w:val="22"/>
         </w:rPr>
-        <w:t xml:space="preserve">Launch Juice Shop and locate the login form; confirm normal behavior with valid/invalid credentials.</w:t>
+        <w:t xml:space="preserve">Register/log in as two customers, User A and User B, and add items to each basket.</w:t>
       </w:r>
     </w:p>
     <w:p>
@@ -1043,7 +1050,7 @@
           <w:sz w:val="22"/>
           <w:szCs w:val="22"/>
         </w:rPr>
-        <w:t xml:space="preserve">Attempt an authentication-bypass payload (e.g., ' OR 1=1-- ) in the email field to log in as the first/admin user.</w:t>
+        <w:t xml:space="preserve">As User A, open browser Dev Tools (Network tab) and locate the GET /rest/basket/{id} request; note the numeric basket id tied to the session.</w:t>
       </w:r>
     </w:p>
     <w:p>
@@ -1061,7 +1068,7 @@
           <w:sz w:val="22"/>
           <w:szCs w:val="22"/>
         </w:rPr>
-        <w:t xml:space="preserve">Use the product search / REST endpoints to attempt a UNION-based injection that returns table data (user table).</w:t>
+        <w:t xml:space="preserve">Re-issue the request (or edit the id in the URL/session) changing {id} to User B's basket number.</w:t>
       </w:r>
     </w:p>
     <w:p>
@@ -1079,7 +1086,7 @@
           <w:sz w:val="22"/>
           <w:szCs w:val="22"/>
         </w:rPr>
-        <w:t xml:space="preserve">Capture the server response and the SQLite data retrieved; document exactly which characters broke the query.</w:t>
+        <w:t xml:space="preserve">Observe User B's basket contents returned to User A — a classic Insecure Direct Object Reference (IDOR).</w:t>
       </w:r>
     </w:p>
     <w:p>
@@ -1091,94 +1098,44 @@
           <w:rFonts w:ascii="Calibri" w:cs="Calibri" w:eastAsia="Calibri" w:hAnsi="Calibri"/>
           <w:b/>
           <w:bCs/>
-          <w:sz w:val="22"/>
-          <w:szCs w:val="22"/>
-        </w:rPr>
-        <w:t xml:space="preserve">Defense &amp; re-test: </w:t>
-      </w:r>
-      <w:r>
-        <w:rPr>
-          <w:rFonts w:ascii="Calibri" w:cs="Calibri" w:eastAsia="Calibri" w:hAnsi="Calibri"/>
-          <w:sz w:val="22"/>
-          <w:szCs w:val="22"/>
-        </w:rPr>
-        <w:t xml:space="preserve">Rebuild the login and search queries in the companion app using parameterized queries (prepared statements) and input validation; repeat the same payloads to show the bypass now fails while valid logins still succeed.</w:t>
-      </w:r>
-    </w:p>
-    <w:p>
-      <w:pPr>
-        <w:spacing w:after="120" w:line="276"/>
-      </w:pPr>
-      <w:r>
-        <w:rPr>
-          <w:rFonts w:ascii="Calibri" w:cs="Calibri" w:eastAsia="Calibri" w:hAnsi="Calibri"/>
-          <w:b w:val="false"/>
-          <w:bCs w:val="false"/>
+          <w:sz w:val="20"/>
+          <w:szCs w:val="20"/>
+        </w:rPr>
+        <w:t xml:space="preserve">Root cause: </w:t>
+      </w:r>
+      <w:r>
+        <w:rPr>
+          <w:rFonts w:ascii="Calibri" w:cs="Calibri" w:eastAsia="Calibri" w:hAnsi="Calibri"/>
           <w:i/>
           <w:iCs/>
-          <w:sz w:val="22"/>
-          <w:szCs w:val="22"/>
-        </w:rPr>
-        <w:t xml:space="preserve">Evidence to capture: payload used, raw request/response from the proxy, screenshot or recording of the result, and the before/after outcome in the scorecard.</w:t>
-      </w:r>
-    </w:p>
-    <w:p>
-      <w:pPr>
-        <w:pStyle w:val="Heading2"/>
-        <w:spacing w:after="80" w:before="160"/>
+          <w:sz w:val="20"/>
+          <w:szCs w:val="20"/>
+        </w:rPr>
+        <w:t xml:space="preserve">The server returns a basket by its id without checking that the id belongs to the logged-in user.</w:t>
+      </w:r>
+    </w:p>
+    <w:p>
+      <w:pPr>
+        <w:spacing w:after="120" w:line="276"/>
       </w:pPr>
       <w:r>
         <w:rPr>
           <w:rFonts w:ascii="Calibri" w:cs="Calibri" w:eastAsia="Calibri" w:hAnsi="Calibri"/>
           <w:b/>
           <w:bCs/>
-          <w:color w:val="2E5496"/>
-          <w:sz w:val="24"/>
-          <w:szCs w:val="24"/>
-        </w:rPr>
-        <w:t xml:space="preserve">Lab 2 – Broken Access Control (IDOR)</w:t>
-      </w:r>
-    </w:p>
-    <w:p>
-      <w:pPr>
-        <w:spacing w:after="120" w:line="276"/>
-      </w:pPr>
-      <w:r>
-        <w:rPr>
-          <w:rFonts w:ascii="Calibri" w:cs="Calibri" w:eastAsia="Calibri" w:hAnsi="Calibri"/>
-          <w:b/>
-          <w:bCs/>
-          <w:sz w:val="22"/>
-          <w:szCs w:val="22"/>
-        </w:rPr>
-        <w:t xml:space="preserve">Research question: </w:t>
-      </w:r>
-      <w:r>
-        <w:rPr>
-          <w:rFonts w:ascii="Calibri" w:cs="Calibri" w:eastAsia="Calibri" w:hAnsi="Calibri"/>
-          <w:i/>
-          <w:iCs/>
-          <w:sz w:val="22"/>
-          <w:szCs w:val="22"/>
-        </w:rPr>
-        <w:t xml:space="preserve">How can broken access control let one user read or modify another user's information?</w:t>
-      </w:r>
-    </w:p>
-    <w:p>
-      <w:pPr>
-        <w:spacing w:after="120" w:line="276"/>
-      </w:pPr>
-      <w:r>
-        <w:rPr>
-          <w:rFonts w:ascii="Calibri" w:cs="Calibri" w:eastAsia="Calibri" w:hAnsi="Calibri"/>
-          <w:b/>
-          <w:bCs/>
-          <w:i w:val="false"/>
-          <w:iCs w:val="false"/>
-          <w:sz w:val="22"/>
-          <w:szCs w:val="22"/>
-        </w:rPr>
-        <w:t xml:space="preserve">Attack procedure:</w:t>
+          <w:sz w:val="22"/>
+          <w:szCs w:val="22"/>
+        </w:rPr>
+        <w:t xml:space="preserve">Challenge: Admin Section  </w:t>
+      </w:r>
+      <w:r>
+        <w:rPr>
+          <w:rFonts w:ascii="Calibri" w:cs="Calibri" w:eastAsia="Calibri" w:hAnsi="Calibri"/>
+          <w:color w:val="C55A11"/>
+          <w:sz w:val="20"/>
+          <w:szCs w:val="20"/>
+        </w:rPr>
+        <w:t xml:space="preserve">★★ (2-star)</w:t>
       </w:r>
     </w:p>
     <w:p>
@@ -1196,7 +1153,7 @@
           <w:sz w:val="22"/>
           <w:szCs w:val="22"/>
         </w:rPr>
-        <w:t xml:space="preserve">Register two separate customer accounts (User A and User B) and add items to each basket.</w:t>
+        <w:t xml:space="preserve">Log in as an ordinary (non-admin) customer.</w:t>
       </w:r>
     </w:p>
     <w:p>
@@ -1214,7 +1171,7 @@
           <w:sz w:val="22"/>
           <w:szCs w:val="22"/>
         </w:rPr>
-        <w:t xml:space="preserve">Log in as User A, capture the basket request in the proxy, and note the numeric basket/ user id.</w:t>
+        <w:t xml:space="preserve">Browse directly to http://localhost:3000/#/administration.</w:t>
       </w:r>
     </w:p>
     <w:p>
@@ -1232,25 +1189,7 @@
           <w:sz w:val="22"/>
           <w:szCs w:val="22"/>
         </w:rPr>
-        <w:t xml:space="preserve">Replay the request changing the id to User B's value to view/modify another customer's basket or data.</w:t>
-      </w:r>
-    </w:p>
-    <w:p>
-      <w:pPr>
-        <w:pStyle w:val="ListParagraph"/>
-        <w:numPr>
-          <w:ilvl w:val="0"/>
-          <w:numId w:val="5"/>
-        </w:numPr>
-        <w:spacing w:after="60" w:line="276"/>
-      </w:pPr>
-      <w:r>
-        <w:rPr>
-          <w:rFonts w:ascii="Calibri" w:cs="Calibri" w:eastAsia="Calibri" w:hAnsi="Calibri"/>
-          <w:sz w:val="22"/>
-          <w:szCs w:val="22"/>
-        </w:rPr>
-        <w:t xml:space="preserve">Attempt to reach an administrative page/endpoint directly by URL without admin rights.</w:t>
+        <w:t xml:space="preserve">The administration page loads with no authorization block, exposing registered users and feedback.</w:t>
       </w:r>
     </w:p>
     <w:p>
@@ -1262,94 +1201,44 @@
           <w:rFonts w:ascii="Calibri" w:cs="Calibri" w:eastAsia="Calibri" w:hAnsi="Calibri"/>
           <w:b/>
           <w:bCs/>
-          <w:sz w:val="22"/>
-          <w:szCs w:val="22"/>
-        </w:rPr>
-        <w:t xml:space="preserve">Defense &amp; re-test: </w:t>
-      </w:r>
-      <w:r>
-        <w:rPr>
-          <w:rFonts w:ascii="Calibri" w:cs="Calibri" w:eastAsia="Calibri" w:hAnsi="Calibri"/>
-          <w:sz w:val="22"/>
-          <w:szCs w:val="22"/>
-        </w:rPr>
-        <w:t xml:space="preserve">In the companion app, add server-side authorization checks that bind every object to the authenticated session (ownership verification) and enforce role checks; re-run the replay attack to show access is denied.</w:t>
-      </w:r>
-    </w:p>
-    <w:p>
-      <w:pPr>
-        <w:spacing w:after="120" w:line="276"/>
-      </w:pPr>
-      <w:r>
-        <w:rPr>
-          <w:rFonts w:ascii="Calibri" w:cs="Calibri" w:eastAsia="Calibri" w:hAnsi="Calibri"/>
-          <w:b w:val="false"/>
-          <w:bCs w:val="false"/>
+          <w:sz w:val="20"/>
+          <w:szCs w:val="20"/>
+        </w:rPr>
+        <w:t xml:space="preserve">Root cause: </w:t>
+      </w:r>
+      <w:r>
+        <w:rPr>
+          <w:rFonts w:ascii="Calibri" w:cs="Calibri" w:eastAsia="Calibri" w:hAnsi="Calibri"/>
           <w:i/>
           <w:iCs/>
-          <w:sz w:val="22"/>
-          <w:szCs w:val="22"/>
-        </w:rPr>
-        <w:t xml:space="preserve">Evidence to capture: payload used, raw request/response from the proxy, screenshot or recording of the result, and the before/after outcome in the scorecard.</w:t>
-      </w:r>
-    </w:p>
-    <w:p>
-      <w:pPr>
-        <w:pStyle w:val="Heading2"/>
-        <w:spacing w:after="80" w:before="160"/>
+          <w:sz w:val="20"/>
+          <w:szCs w:val="20"/>
+        </w:rPr>
+        <w:t xml:space="preserve">The admin route enforces no server-side role check; the client simply never shows the link.</w:t>
+      </w:r>
+    </w:p>
+    <w:p>
+      <w:pPr>
+        <w:spacing w:after="120" w:line="276"/>
       </w:pPr>
       <w:r>
         <w:rPr>
           <w:rFonts w:ascii="Calibri" w:cs="Calibri" w:eastAsia="Calibri" w:hAnsi="Calibri"/>
           <w:b/>
           <w:bCs/>
-          <w:color w:val="2E5496"/>
-          <w:sz w:val="24"/>
-          <w:szCs w:val="24"/>
-        </w:rPr>
-        <w:t xml:space="preserve">Lab 3 – Cross-Site Scripting (XSS)</w:t>
-      </w:r>
-    </w:p>
-    <w:p>
-      <w:pPr>
-        <w:spacing w:after="120" w:line="276"/>
-      </w:pPr>
-      <w:r>
-        <w:rPr>
-          <w:rFonts w:ascii="Calibri" w:cs="Calibri" w:eastAsia="Calibri" w:hAnsi="Calibri"/>
-          <w:b/>
-          <w:bCs/>
-          <w:sz w:val="22"/>
-          <w:szCs w:val="22"/>
-        </w:rPr>
-        <w:t xml:space="preserve">Research question: </w:t>
-      </w:r>
-      <w:r>
-        <w:rPr>
-          <w:rFonts w:ascii="Calibri" w:cs="Calibri" w:eastAsia="Calibri" w:hAnsi="Calibri"/>
-          <w:i/>
-          <w:iCs/>
-          <w:sz w:val="22"/>
-          <w:szCs w:val="22"/>
-        </w:rPr>
-        <w:t xml:space="preserve">How can XSS deliver untrusted scripts into another user's browser?</w:t>
-      </w:r>
-    </w:p>
-    <w:p>
-      <w:pPr>
-        <w:spacing w:after="120" w:line="276"/>
-      </w:pPr>
-      <w:r>
-        <w:rPr>
-          <w:rFonts w:ascii="Calibri" w:cs="Calibri" w:eastAsia="Calibri" w:hAnsi="Calibri"/>
-          <w:b/>
-          <w:bCs/>
-          <w:i w:val="false"/>
-          <w:iCs w:val="false"/>
-          <w:sz w:val="22"/>
-          <w:szCs w:val="22"/>
-        </w:rPr>
-        <w:t xml:space="preserve">Attack procedure:</w:t>
+          <w:sz w:val="22"/>
+          <w:szCs w:val="22"/>
+        </w:rPr>
+        <w:t xml:space="preserve">Challenge: Confidential Document  </w:t>
+      </w:r>
+      <w:r>
+        <w:rPr>
+          <w:rFonts w:ascii="Calibri" w:cs="Calibri" w:eastAsia="Calibri" w:hAnsi="Calibri"/>
+          <w:color w:val="C55A11"/>
+          <w:sz w:val="20"/>
+          <w:szCs w:val="20"/>
+        </w:rPr>
+        <w:t xml:space="preserve">★ (1-star)</w:t>
       </w:r>
     </w:p>
     <w:p>
@@ -1367,7 +1256,7 @@
           <w:sz w:val="22"/>
           <w:szCs w:val="22"/>
         </w:rPr>
-        <w:t xml:space="preserve">Identify an input that is reflected into the page (e.g., the search field) and submit a benign &lt;script&gt; / &lt;iframe&gt; payload.</w:t>
+        <w:t xml:space="preserve">Open the About Us page and follow its link to the legal/terms document under the /ftp path.</w:t>
       </w:r>
     </w:p>
     <w:p>
@@ -1385,7 +1274,7 @@
           <w:sz w:val="22"/>
           <w:szCs w:val="22"/>
         </w:rPr>
-        <w:t xml:space="preserve">Confirm the script executes (alert / DOM change) to prove reflected or DOM-based XSS.</w:t>
+        <w:t xml:space="preserve">Edit the URL to request http://localhost:3000/ftp/legal.md (or another file in /ftp).</w:t>
       </w:r>
     </w:p>
     <w:p>
@@ -1403,25 +1292,7 @@
           <w:sz w:val="22"/>
           <w:szCs w:val="22"/>
         </w:rPr>
-        <w:t xml:space="preserve">Demonstrate impact by reading a cookie or session value via the injected script (proof-of-concept only).</w:t>
-      </w:r>
-    </w:p>
-    <w:p>
-      <w:pPr>
-        <w:pStyle w:val="ListParagraph"/>
-        <w:numPr>
-          <w:ilvl w:val="0"/>
-          <w:numId w:val="6"/>
-        </w:numPr>
-        <w:spacing w:after="60" w:line="276"/>
-      </w:pPr>
-      <w:r>
-        <w:rPr>
-          <w:rFonts w:ascii="Calibri" w:cs="Calibri" w:eastAsia="Calibri" w:hAnsi="Calibri"/>
-          <w:sz w:val="22"/>
-          <w:szCs w:val="22"/>
-        </w:rPr>
-        <w:t xml:space="preserve">Record the exact payload, the sink where it executed, and a screenshot of execution.</w:t>
+        <w:t xml:space="preserve">Retrieve a server document that should not be publicly reachable.</w:t>
       </w:r>
     </w:p>
     <w:p>
@@ -1433,6 +1304,31 @@
           <w:rFonts w:ascii="Calibri" w:cs="Calibri" w:eastAsia="Calibri" w:hAnsi="Calibri"/>
           <w:b/>
           <w:bCs/>
+          <w:sz w:val="20"/>
+          <w:szCs w:val="20"/>
+        </w:rPr>
+        <w:t xml:space="preserve">Root cause: </w:t>
+      </w:r>
+      <w:r>
+        <w:rPr>
+          <w:rFonts w:ascii="Calibri" w:cs="Calibri" w:eastAsia="Calibri" w:hAnsi="Calibri"/>
+          <w:i/>
+          <w:iCs/>
+          <w:sz w:val="20"/>
+          <w:szCs w:val="20"/>
+        </w:rPr>
+        <w:t xml:space="preserve">A static directory is served without access control, exposing files by direct path (path/forced browsing).</w:t>
+      </w:r>
+    </w:p>
+    <w:p>
+      <w:pPr>
+        <w:spacing w:after="120" w:line="276"/>
+      </w:pPr>
+      <w:r>
+        <w:rPr>
+          <w:rFonts w:ascii="Calibri" w:cs="Calibri" w:eastAsia="Calibri" w:hAnsi="Calibri"/>
+          <w:b/>
+          <w:bCs/>
           <w:sz w:val="22"/>
           <w:szCs w:val="22"/>
         </w:rPr>
@@ -1444,7 +1340,7 @@
           <w:sz w:val="22"/>
           <w:szCs w:val="22"/>
         </w:rPr>
-        <w:t xml:space="preserve">In the companion app, apply output encoding/escaping, input sanitization, and a Content-Security-Policy header; re-submit the payloads to show they are rendered as inert text.</w:t>
+        <w:t xml:space="preserve">In the companion app, enforce server-side authorization on every request: bind each object (basket, document) to the authenticated session and verify ownership before returning it; gate admin routes behind a role check (middleware), not just a hidden link; and remove directory browsing / require authorization on file paths. Re-run all three attacks to show access is now denied (HTTP 401/403) while the legitimate owner/admin still succeeds.</w:t>
       </w:r>
     </w:p>
     <w:p>
@@ -1461,7 +1357,395 @@
           <w:sz w:val="22"/>
           <w:szCs w:val="22"/>
         </w:rPr>
-        <w:t xml:space="preserve">Evidence to capture: payload used, raw request/response from the proxy, screenshot or recording of the result, and the before/after outcome in the scorecard.</w:t>
+        <w:t xml:space="preserve">Evidence to capture: the payload/URL used, raw request/response from Dev Tools or the proxy, a screenshot of the result, the Score Board showing the challenge solved, and the before/after outcome in the scorecard.</w:t>
+      </w:r>
+    </w:p>
+    <w:p>
+      <w:pPr>
+        <w:pStyle w:val="Heading2"/>
+        <w:spacing w:after="80" w:before="160"/>
+      </w:pPr>
+      <w:r>
+        <w:rPr>
+          <w:rFonts w:ascii="Calibri" w:cs="Calibri" w:eastAsia="Calibri" w:hAnsi="Calibri"/>
+          <w:b/>
+          <w:bCs/>
+          <w:color w:val="2E5496"/>
+          <w:sz w:val="24"/>
+          <w:szCs w:val="24"/>
+        </w:rPr>
+        <w:t xml:space="preserve">Lab 2 – SQL Injection</w:t>
+      </w:r>
+    </w:p>
+    <w:p>
+      <w:pPr>
+        <w:spacing w:after="120" w:line="276"/>
+      </w:pPr>
+      <w:r>
+        <w:rPr>
+          <w:rFonts w:ascii="Calibri" w:cs="Calibri" w:eastAsia="Calibri" w:hAnsi="Calibri"/>
+          <w:b/>
+          <w:bCs/>
+          <w:sz w:val="22"/>
+          <w:szCs w:val="22"/>
+        </w:rPr>
+        <w:t xml:space="preserve">Research question: </w:t>
+      </w:r>
+      <w:r>
+        <w:rPr>
+          <w:rFonts w:ascii="Calibri" w:cs="Calibri" w:eastAsia="Calibri" w:hAnsi="Calibri"/>
+          <w:i/>
+          <w:iCs/>
+          <w:sz w:val="22"/>
+          <w:szCs w:val="22"/>
+        </w:rPr>
+        <w:t xml:space="preserve">How can unsafe handling of login input let an attacker bypass authentication without valid credentials?</w:t>
+      </w:r>
+    </w:p>
+    <w:p>
+      <w:pPr>
+        <w:spacing w:after="120" w:line="276"/>
+      </w:pPr>
+      <w:r>
+        <w:rPr>
+          <w:rFonts w:ascii="Calibri" w:cs="Calibri" w:eastAsia="Calibri" w:hAnsi="Calibri"/>
+          <w:b/>
+          <w:bCs/>
+          <w:sz w:val="22"/>
+          <w:szCs w:val="22"/>
+        </w:rPr>
+        <w:t xml:space="preserve">Challenge: Login Admin  </w:t>
+      </w:r>
+      <w:r>
+        <w:rPr>
+          <w:rFonts w:ascii="Calibri" w:cs="Calibri" w:eastAsia="Calibri" w:hAnsi="Calibri"/>
+          <w:color w:val="C55A11"/>
+          <w:sz w:val="20"/>
+          <w:szCs w:val="20"/>
+        </w:rPr>
+        <w:t xml:space="preserve">★★ (2-star)</w:t>
+      </w:r>
+    </w:p>
+    <w:p>
+      <w:pPr>
+        <w:pStyle w:val="ListParagraph"/>
+        <w:numPr>
+          <w:ilvl w:val="0"/>
+          <w:numId w:val="7"/>
+        </w:numPr>
+        <w:spacing w:after="60" w:line="276"/>
+      </w:pPr>
+      <w:r>
+        <w:rPr>
+          <w:rFonts w:ascii="Calibri" w:cs="Calibri" w:eastAsia="Calibri" w:hAnsi="Calibri"/>
+          <w:sz w:val="22"/>
+          <w:szCs w:val="22"/>
+        </w:rPr>
+        <w:t xml:space="preserve">Open the login form and confirm normal behavior: a wrong password is rejected.</w:t>
+      </w:r>
+    </w:p>
+    <w:p>
+      <w:pPr>
+        <w:pStyle w:val="ListParagraph"/>
+        <w:numPr>
+          <w:ilvl w:val="0"/>
+          <w:numId w:val="7"/>
+        </w:numPr>
+        <w:spacing w:after="60" w:line="276"/>
+      </w:pPr>
+      <w:r>
+        <w:rPr>
+          <w:rFonts w:ascii="Calibri" w:cs="Calibri" w:eastAsia="Calibri" w:hAnsi="Calibri"/>
+          <w:sz w:val="22"/>
+          <w:szCs w:val="22"/>
+        </w:rPr>
+        <w:t xml:space="preserve">In the email field enter  ' OR 1=1--  and type any value as the password.</w:t>
+      </w:r>
+    </w:p>
+    <w:p>
+      <w:pPr>
+        <w:pStyle w:val="ListParagraph"/>
+        <w:numPr>
+          <w:ilvl w:val="0"/>
+          <w:numId w:val="7"/>
+        </w:numPr>
+        <w:spacing w:after="60" w:line="276"/>
+      </w:pPr>
+      <w:r>
+        <w:rPr>
+          <w:rFonts w:ascii="Calibri" w:cs="Calibri" w:eastAsia="Calibri" w:hAnsi="Calibri"/>
+          <w:sz w:val="22"/>
+          <w:szCs w:val="22"/>
+        </w:rPr>
+        <w:t xml:space="preserve">Submit — the application logs you in as the administrator (the first row returned).</w:t>
+      </w:r>
+    </w:p>
+    <w:p>
+      <w:pPr>
+        <w:pStyle w:val="ListParagraph"/>
+        <w:numPr>
+          <w:ilvl w:val="0"/>
+          <w:numId w:val="7"/>
+        </w:numPr>
+        <w:spacing w:after="60" w:line="276"/>
+      </w:pPr>
+      <w:r>
+        <w:rPr>
+          <w:rFonts w:ascii="Calibri" w:cs="Calibri" w:eastAsia="Calibri" w:hAnsi="Calibri"/>
+          <w:sz w:val="22"/>
+          <w:szCs w:val="22"/>
+        </w:rPr>
+        <w:t xml:space="preserve">In Dev Tools, capture the POST /rest/user/login request/response as evidence of the bypass.</w:t>
+      </w:r>
+    </w:p>
+    <w:p>
+      <w:pPr>
+        <w:spacing w:after="120" w:line="276"/>
+      </w:pPr>
+      <w:r>
+        <w:rPr>
+          <w:rFonts w:ascii="Calibri" w:cs="Calibri" w:eastAsia="Calibri" w:hAnsi="Calibri"/>
+          <w:b/>
+          <w:bCs/>
+          <w:sz w:val="20"/>
+          <w:szCs w:val="20"/>
+        </w:rPr>
+        <w:t xml:space="preserve">Root cause: </w:t>
+      </w:r>
+      <w:r>
+        <w:rPr>
+          <w:rFonts w:ascii="Calibri" w:cs="Calibri" w:eastAsia="Calibri" w:hAnsi="Calibri"/>
+          <w:i/>
+          <w:iCs/>
+          <w:sz w:val="20"/>
+          <w:szCs w:val="20"/>
+        </w:rPr>
+        <w:t xml:space="preserve">The login query concatenates the email string directly into SQL, so  ' OR 1=1--  turns the WHERE clause always-true and comments out the password check.</w:t>
+      </w:r>
+    </w:p>
+    <w:p>
+      <w:pPr>
+        <w:spacing w:after="120" w:line="276"/>
+      </w:pPr>
+      <w:r>
+        <w:rPr>
+          <w:rFonts w:ascii="Calibri" w:cs="Calibri" w:eastAsia="Calibri" w:hAnsi="Calibri"/>
+          <w:b/>
+          <w:bCs/>
+          <w:sz w:val="22"/>
+          <w:szCs w:val="22"/>
+        </w:rPr>
+        <w:t xml:space="preserve">Defense &amp; re-test: </w:t>
+      </w:r>
+      <w:r>
+        <w:rPr>
+          <w:rFonts w:ascii="Calibri" w:cs="Calibri" w:eastAsia="Calibri" w:hAnsi="Calibri"/>
+          <w:sz w:val="22"/>
+          <w:szCs w:val="22"/>
+        </w:rPr>
+        <w:t xml:space="preserve">In the companion app, rebuild the login query with a parameterized (prepared) statement so user input is treated strictly as data, add input validation, and verify the password with a salted hash. Re-submit  ' OR 1=1--  to show the bypass now fails while valid credentials still log in.</w:t>
+      </w:r>
+    </w:p>
+    <w:p>
+      <w:pPr>
+        <w:spacing w:after="120" w:line="276"/>
+      </w:pPr>
+      <w:r>
+        <w:rPr>
+          <w:rFonts w:ascii="Calibri" w:cs="Calibri" w:eastAsia="Calibri" w:hAnsi="Calibri"/>
+          <w:b w:val="false"/>
+          <w:bCs w:val="false"/>
+          <w:i/>
+          <w:iCs/>
+          <w:sz w:val="22"/>
+          <w:szCs w:val="22"/>
+        </w:rPr>
+        <w:t xml:space="preserve">Evidence to capture: the payload/URL used, raw request/response from Dev Tools or the proxy, a screenshot of the result, the Score Board showing the challenge solved, and the before/after outcome in the scorecard.</w:t>
+      </w:r>
+    </w:p>
+    <w:p>
+      <w:pPr>
+        <w:pStyle w:val="Heading2"/>
+        <w:spacing w:after="80" w:before="160"/>
+      </w:pPr>
+      <w:r>
+        <w:rPr>
+          <w:rFonts w:ascii="Calibri" w:cs="Calibri" w:eastAsia="Calibri" w:hAnsi="Calibri"/>
+          <w:b/>
+          <w:bCs/>
+          <w:color w:val="2E5496"/>
+          <w:sz w:val="24"/>
+          <w:szCs w:val="24"/>
+        </w:rPr>
+        <w:t xml:space="preserve">Lab 3 – Cross-Site Scripting (XSS)</w:t>
+      </w:r>
+    </w:p>
+    <w:p>
+      <w:pPr>
+        <w:spacing w:after="120" w:line="276"/>
+      </w:pPr>
+      <w:r>
+        <w:rPr>
+          <w:rFonts w:ascii="Calibri" w:cs="Calibri" w:eastAsia="Calibri" w:hAnsi="Calibri"/>
+          <w:b/>
+          <w:bCs/>
+          <w:sz w:val="22"/>
+          <w:szCs w:val="22"/>
+        </w:rPr>
+        <w:t xml:space="preserve">Research question: </w:t>
+      </w:r>
+      <w:r>
+        <w:rPr>
+          <w:rFonts w:ascii="Calibri" w:cs="Calibri" w:eastAsia="Calibri" w:hAnsi="Calibri"/>
+          <w:i/>
+          <w:iCs/>
+          <w:sz w:val="22"/>
+          <w:szCs w:val="22"/>
+        </w:rPr>
+        <w:t xml:space="preserve">How can unsanitized input cause the browser to execute an attacker's script?</w:t>
+      </w:r>
+    </w:p>
+    <w:p>
+      <w:pPr>
+        <w:spacing w:after="120" w:line="276"/>
+      </w:pPr>
+      <w:r>
+        <w:rPr>
+          <w:rFonts w:ascii="Calibri" w:cs="Calibri" w:eastAsia="Calibri" w:hAnsi="Calibri"/>
+          <w:b/>
+          <w:bCs/>
+          <w:sz w:val="22"/>
+          <w:szCs w:val="22"/>
+        </w:rPr>
+        <w:t xml:space="preserve">Challenge: DOM XSS  </w:t>
+      </w:r>
+      <w:r>
+        <w:rPr>
+          <w:rFonts w:ascii="Calibri" w:cs="Calibri" w:eastAsia="Calibri" w:hAnsi="Calibri"/>
+          <w:color w:val="C55A11"/>
+          <w:sz w:val="20"/>
+          <w:szCs w:val="20"/>
+        </w:rPr>
+        <w:t xml:space="preserve">★ (1-star)</w:t>
+      </w:r>
+    </w:p>
+    <w:p>
+      <w:pPr>
+        <w:pStyle w:val="ListParagraph"/>
+        <w:numPr>
+          <w:ilvl w:val="0"/>
+          <w:numId w:val="8"/>
+        </w:numPr>
+        <w:spacing w:after="60" w:line="276"/>
+      </w:pPr>
+      <w:r>
+        <w:rPr>
+          <w:rFonts w:ascii="Calibri" w:cs="Calibri" w:eastAsia="Calibri" w:hAnsi="Calibri"/>
+          <w:sz w:val="22"/>
+          <w:szCs w:val="22"/>
+        </w:rPr>
+        <w:t xml:space="preserve">In the product search bar, enter the payload  &lt;iframe src="javascript:alert(`xss`)"&gt;  and submit.</w:t>
+      </w:r>
+    </w:p>
+    <w:p>
+      <w:pPr>
+        <w:pStyle w:val="ListParagraph"/>
+        <w:numPr>
+          <w:ilvl w:val="0"/>
+          <w:numId w:val="8"/>
+        </w:numPr>
+        <w:spacing w:after="60" w:line="276"/>
+      </w:pPr>
+      <w:r>
+        <w:rPr>
+          <w:rFonts w:ascii="Calibri" w:cs="Calibri" w:eastAsia="Calibri" w:hAnsi="Calibri"/>
+          <w:sz w:val="22"/>
+          <w:szCs w:val="22"/>
+        </w:rPr>
+        <w:t xml:space="preserve">The injected markup is written into the page DOM and the script runs — an alert box appears.</w:t>
+      </w:r>
+    </w:p>
+    <w:p>
+      <w:pPr>
+        <w:pStyle w:val="ListParagraph"/>
+        <w:numPr>
+          <w:ilvl w:val="0"/>
+          <w:numId w:val="8"/>
+        </w:numPr>
+        <w:spacing w:after="60" w:line="276"/>
+      </w:pPr>
+      <w:r>
+        <w:rPr>
+          <w:rFonts w:ascii="Calibri" w:cs="Calibri" w:eastAsia="Calibri" w:hAnsi="Calibri"/>
+          <w:sz w:val="22"/>
+          <w:szCs w:val="22"/>
+        </w:rPr>
+        <w:t xml:space="preserve">Record the payload, the search sink where it executed, and a screenshot of the alert as proof of DOM-based XSS.</w:t>
+      </w:r>
+    </w:p>
+    <w:p>
+      <w:pPr>
+        <w:spacing w:after="120" w:line="276"/>
+      </w:pPr>
+      <w:r>
+        <w:rPr>
+          <w:rFonts w:ascii="Calibri" w:cs="Calibri" w:eastAsia="Calibri" w:hAnsi="Calibri"/>
+          <w:b/>
+          <w:bCs/>
+          <w:sz w:val="20"/>
+          <w:szCs w:val="20"/>
+        </w:rPr>
+        <w:t xml:space="preserve">Root cause: </w:t>
+      </w:r>
+      <w:r>
+        <w:rPr>
+          <w:rFonts w:ascii="Calibri" w:cs="Calibri" w:eastAsia="Calibri" w:hAnsi="Calibri"/>
+          <w:i/>
+          <w:iCs/>
+          <w:sz w:val="20"/>
+          <w:szCs w:val="20"/>
+        </w:rPr>
+        <w:t xml:space="preserve">The search term is inserted into the page DOM without sanitization/encoding, so markup is interpreted as live HTML/JavaScript.</w:t>
+      </w:r>
+    </w:p>
+    <w:p>
+      <w:pPr>
+        <w:spacing w:after="120" w:line="276"/>
+      </w:pPr>
+      <w:r>
+        <w:rPr>
+          <w:rFonts w:ascii="Calibri" w:cs="Calibri" w:eastAsia="Calibri" w:hAnsi="Calibri"/>
+          <w:b/>
+          <w:bCs/>
+          <w:sz w:val="22"/>
+          <w:szCs w:val="22"/>
+        </w:rPr>
+        <w:t xml:space="preserve">Defense &amp; re-test: </w:t>
+      </w:r>
+      <w:r>
+        <w:rPr>
+          <w:rFonts w:ascii="Calibri" w:cs="Calibri" w:eastAsia="Calibri" w:hAnsi="Calibri"/>
+          <w:sz w:val="22"/>
+          <w:szCs w:val="22"/>
+        </w:rPr>
+        <w:t xml:space="preserve">In the companion app, apply context-aware output encoding, sanitize/escape user input before it reaches the DOM, and set a Content-Security-Policy header. Re-submit the same payload to show it is rendered as inert text rather than executing.</w:t>
+      </w:r>
+    </w:p>
+    <w:p>
+      <w:pPr>
+        <w:spacing w:after="120" w:line="276"/>
+      </w:pPr>
+      <w:r>
+        <w:rPr>
+          <w:rFonts w:ascii="Calibri" w:cs="Calibri" w:eastAsia="Calibri" w:hAnsi="Calibri"/>
+          <w:b w:val="false"/>
+          <w:bCs w:val="false"/>
+          <w:i/>
+          <w:iCs/>
+          <w:sz w:val="22"/>
+          <w:szCs w:val="22"/>
+        </w:rPr>
+        <w:t xml:space="preserve">Evidence to capture: the payload/URL used, raw request/response from Dev Tools or the proxy, a screenshot of the result, the Score Board showing the challenge solved, and the before/after outcome in the scorecard.</w:t>
       </w:r>
     </w:p>
     <w:p>
@@ -2377,7 +2661,7 @@
                 <w:sz w:val="18"/>
                 <w:szCs w:val="18"/>
               </w:rPr>
-              <w:t xml:space="preserve">Environment setup (Docker, Juice Shop, Burp/ZAP)</w:t>
+              <w:t xml:space="preserve">Environment setup (Docker, Juice Shop, Dev Tools/ZAP)</w:t>
             </w:r>
           </w:p>
         </w:tc>
@@ -2509,7 +2793,7 @@
                 <w:sz w:val="18"/>
                 <w:szCs w:val="18"/>
               </w:rPr>
-              <w:t xml:space="preserve">Reconnaissance &amp; scoping of target app</w:t>
+              <w:t xml:space="preserve">Find Score Board &amp; scope target challenges</w:t>
             </w:r>
           </w:p>
         </w:tc>
@@ -2640,7 +2924,7 @@
                 <w:sz w:val="18"/>
                 <w:szCs w:val="18"/>
               </w:rPr>
-              <w:t xml:space="preserve">Lab 1 – SQL Injection (login bypass + data extraction)</w:t>
+              <w:t xml:space="preserve">Lab 1 – Access Control (Basket, Admin, Confidential Doc)</w:t>
             </w:r>
           </w:p>
         </w:tc>
@@ -2772,7 +3056,7 @@
                 <w:sz w:val="18"/>
                 <w:szCs w:val="18"/>
               </w:rPr>
-              <w:t xml:space="preserve">Lab 2 – Broken Access Control (IDOR / basket)</w:t>
+              <w:t xml:space="preserve">Lab 2 – SQL Injection (Login Admin)</w:t>
             </w:r>
           </w:p>
         </w:tc>
@@ -2904,7 +3188,7 @@
                 <w:sz w:val="18"/>
                 <w:szCs w:val="18"/>
               </w:rPr>
-              <w:t xml:space="preserve">Lab 3 – Cross-Site Scripting (reflected/DOM)</w:t>
+              <w:t xml:space="preserve">Lab 3 – DOM XSS (search bar payload)</w:t>
             </w:r>
           </w:p>
         </w:tc>
@@ -2966,7 +3250,6 @@
               <w:bottom w:val="single" w:color="AAAAAA" w:sz="4"/>
               <w:right w:val="single" w:color="AAAAAA" w:sz="4"/>
             </w:tcBorders>
-            <w:shd w:fill="4472C4" w:color="auto" w:val="clear"/>
           </w:tcPr>
           <w:p/>
         </w:tc>
@@ -3823,7 +4106,7 @@
         <w:pStyle w:val="ListParagraph"/>
         <w:numPr>
           <w:ilvl w:val="0"/>
-          <w:numId w:val="7"/>
+          <w:numId w:val="9"/>
         </w:numPr>
         <w:spacing w:after="100" w:line="276"/>
       </w:pPr>
@@ -3841,7 +4124,7 @@
         <w:pStyle w:val="ListParagraph"/>
         <w:numPr>
           <w:ilvl w:val="0"/>
-          <w:numId w:val="7"/>
+          <w:numId w:val="9"/>
         </w:numPr>
         <w:spacing w:after="100" w:line="276"/>
       </w:pPr>
@@ -3859,7 +4142,7 @@
         <w:pStyle w:val="ListParagraph"/>
         <w:numPr>
           <w:ilvl w:val="0"/>
-          <w:numId w:val="7"/>
+          <w:numId w:val="9"/>
         </w:numPr>
         <w:spacing w:after="100" w:line="276"/>
       </w:pPr>
@@ -3877,7 +4160,7 @@
         <w:pStyle w:val="ListParagraph"/>
         <w:numPr>
           <w:ilvl w:val="0"/>
-          <w:numId w:val="7"/>
+          <w:numId w:val="9"/>
         </w:numPr>
         <w:spacing w:after="100" w:line="276"/>
       </w:pPr>
@@ -4146,6 +4429,18 @@
     </w:lvlOverride>
   </w:num>
   <w:num w:numId="7">
+    <w:abstractNumId w:val="3"/>
+    <w:lvlOverride w:ilvl="0">
+      <w:startOverride w:val="1"/>
+    </w:lvlOverride>
+  </w:num>
+  <w:num w:numId="8">
+    <w:abstractNumId w:val="3"/>
+    <w:lvlOverride w:ilvl="0">
+      <w:startOverride w:val="1"/>
+    </w:lvlOverride>
+  </w:num>
+  <w:num w:numId="9">
     <w:abstractNumId w:val="4"/>
     <w:lvlOverride w:ilvl="0">
       <w:startOverride w:val="1"/>

</xml_diff>